<commit_message>
pdf metoduna döküman eklemesi yapıldı
</commit_message>
<xml_diff>
--- a/softwareproposal2.docx
+++ b/softwareproposal2.docx
@@ -7,27 +7,27 @@
         <w:pStyle w:val="Title"/>
       </w:pPr>
       <w:r>
-        <w:t>Hasta Randevu ve Elektronik Reçete Yönetim Sistemi - Proje Teklifi</w:t>
+        <w:t>Sağlık Kurumu Dijital Randevu &amp; Elektronik Reçete Sistemi - Proje Teklifi</w:t>
       </w:r>
     </w:p>
     <w:p>
       <w:r>
-        <w:t>Şirket: [Kurum İsmi Eklenmeli]</w:t>
+        <w:t>Şirket: XYZ Sağlık Hizmetleri A.Ş.</w:t>
       </w:r>
     </w:p>
     <w:p>
       <w:r>
-        <w:t>Teklif Teslim Tarihi: 2024-07-12</w:t>
+        <w:t>Teklif Teslim Tarihi: 2024-07-30</w:t>
       </w:r>
     </w:p>
     <w:p>
       <w:r>
-        <w:t>Proje Teslim Tarihi: 2024-12-12</w:t>
+        <w:t>Proje Teslim Tarihi: 2024-12-31</w:t>
       </w:r>
     </w:p>
     <w:p>
       <w:r>
-        <w:t>Bütçe: Bütçe teklif bazında sunulacaktır.</w:t>
+        <w:t>Bütçe: Bütçe proje teklifleri ile birlikte değerlendirilecek olup, toplam sahip olma maliyetinin makul piyasa oranları dahilinde olması beklenmektedir.</w:t>
       </w:r>
     </w:p>
     <w:p/>
@@ -48,7 +48,7 @@
           <w:b w:val="0"/>
           <w:i w:val="0"/>
         </w:rPr>
-        <w:t>Bu proje kapsamında, kurumun dijital sağlık hizmetlerini modernize edecek, React ve .NET Core tabanlı, mobil uyumlu ve yasal/teknik standartlara tam uyumlu bir hasta randevu ile elektronik reçete yönetim sistemi kurulacaktır.</w:t>
+        <w:t>Bu proje, sağlık kurumlarının dijital dönüşümünü desteklemek amacıyla, hasta randevu yönetimi, elektronik reçete iş akışları ve gelişmiş raporlama yeteneklerini tek platformda toplayacak modern, güvenli ve mevzuata tam uyumlu bir bilgi sistemi kurulmasını hedefler. Web tabanlı, responsive ve RESTful entegrasyonlara açık mimaride inşa edilecek sistem, yüksek erişilebilirlik, kullanıcı dostu arayüz ve yasal regülasyonlara uygun veri işleme özellikleri ile öne çıkacaktır.</w:t>
       </w:r>
     </w:p>
     <w:p>
@@ -64,7 +64,7 @@
         <w:pStyle w:val="ListBullet"/>
       </w:pPr>
       <w:r>
-        <w:t>- Randevu ve reçete işlemlerinde dijital dönüşüm sağlamak</w:t>
+        <w:t>- Klinik, hasta ve yönetici rollerinin hızlı ve kolay randevu yönetimi sağlayabilmesini mümkün kılmak.</w:t>
       </w:r>
     </w:p>
     <w:p>
@@ -72,7 +72,7 @@
         <w:pStyle w:val="ListBullet"/>
       </w:pPr>
       <w:r>
-        <w:t>- Mobil/tablet uyumlu, erişilebilir ve kullanıcı dostu bir arayüz sağlamak</w:t>
+        <w:t>- Elektronik reçete oluşturma, imzalama ve erişimini eczane ve hastaya kadar kapsayıcı şekilde yönetmek.</w:t>
       </w:r>
     </w:p>
     <w:p>
@@ -80,7 +80,7 @@
         <w:pStyle w:val="ListBullet"/>
       </w:pPr>
       <w:r>
-        <w:t>- Güvenli, yasalara tamamen uyumlu veri yönetimini sağlamak (KVKK &amp; GDPR)</w:t>
+        <w:t>- Yönetici dashboard'unda canlı ve geçmiş verilere dair hızlı/kapsamlı görsel raporlar sunmak.</w:t>
       </w:r>
     </w:p>
     <w:p>
@@ -88,7 +88,7 @@
         <w:pStyle w:val="ListBullet"/>
       </w:pPr>
       <w:r>
-        <w:t>- Sistemin yüksek sürekliliğini sağlamak (%99,5 uptime, hızlı yedekleme/kurtarma)</w:t>
+        <w:t>- Sağlık Bakanlığı, e-nabız ve diğer dış sistemlerle entegre çalışabilmek.</w:t>
       </w:r>
     </w:p>
     <w:p>
@@ -96,7 +96,15 @@
         <w:pStyle w:val="ListBullet"/>
       </w:pPr>
       <w:r>
-        <w:t>- Doktor, hasta ve yönetici rollerine uygun süreç ve raporlamaları tesis etmek</w:t>
+        <w:t>- KVKK/GDPR başta olmak üzere regülasyonlara tam uyum ve üst düzey veri güvenliği sağlamak.</w:t>
+      </w:r>
+    </w:p>
+    <w:p>
+      <w:pPr>
+        <w:pStyle w:val="ListBullet"/>
+      </w:pPr>
+      <w:r>
+        <w:t>- Kullanıcı başına 3 tık/2 sn hedefiyle işlem verimliliğini maksimuma çıkarmak.</w:t>
       </w:r>
     </w:p>
     <w:p>
@@ -116,7 +124,7 @@
           <w:b w:val="0"/>
           <w:i w:val="0"/>
         </w:rPr>
-        <w:t>React tabanlı SPA, .NET Core API ve veri tabanı entegrasyonu; hasta, doktor, sekreter ve yönetici arayüzleri; elektronik reçete modülü; bildirim mekanizmaları; sistem ve kullanıcı yetkilendirme araçları; veri yedekleme ve kurtarma altyapısı; KVKK-GDPR uyum dokümantasyonu; teknik ve kullanıcı eğitimleri sunulacaktır.</w:t>
+        <w:t>Sistemin çoklu dilde (TR/EN) ve mobil uyumlu web tabanlı arayüz ile uygulanması, tüm kullanıcı ve rol senaryolarında randevu/recepete yönetimi için modül geliştirilmesi, yönetici dashboardu ve veri görselleştirme raporları üretimi, RESTful API ile bakanlık/vaka yönetim dış sistem entegrasyonu, KVKK ve GDPR uyumunun sağlanması, rol tabanlı erişim ile güvenlik kurguları ve 7/24 erişilebilir, SLA'lı destek süreçlerinin planlanması.</w:t>
       </w:r>
     </w:p>
     <w:p>
@@ -132,7 +140,7 @@
         <w:pStyle w:val="ListBullet"/>
       </w:pPr>
       <w:r>
-        <w:t>- Kritik veri ve sistem güvenliği açıkları oluşması</w:t>
+        <w:t>- Üçüncü parti sağlık sistemleriyle entegrasyonun proje akışına gecikme riski oluşturması.</w:t>
       </w:r>
     </w:p>
     <w:p>
@@ -140,7 +148,7 @@
         <w:pStyle w:val="ListBullet"/>
       </w:pPr>
       <w:r>
-        <w:t>- Yasal mevzuata (KVKK &amp; GDPR) uyumsuzluk riskleri</w:t>
+        <w:t>- Verinin Türkiye sınırları dışında saklanamayacak olması nedeniyle altyapı esnekliğinin sınırlanması.</w:t>
       </w:r>
     </w:p>
     <w:p>
@@ -148,7 +156,7 @@
         <w:pStyle w:val="ListBullet"/>
       </w:pPr>
       <w:r>
-        <w:t>- Mobil uyumluluğun sağlanamaması</w:t>
+        <w:t>- Mevzuat gereği canlı veriyle demo ve test yapılamaması (mock veri zorunluluğu).</w:t>
       </w:r>
     </w:p>
     <w:p>
@@ -156,7 +164,7 @@
         <w:pStyle w:val="ListBullet"/>
       </w:pPr>
       <w:r>
-        <w:t>- SLA ve yüksek sürekliliğin ihlal edilmesi</w:t>
+        <w:t>- Kullanıcı eğitimlerinin 2 güne sığdırılması zorunluluğu.</w:t>
       </w:r>
     </w:p>
     <w:p>
@@ -164,7 +172,7 @@
         <w:pStyle w:val="ListBullet"/>
       </w:pPr>
       <w:r>
-        <w:t>- Olağanüstü durum yedeklemesinin test edilmemesi</w:t>
+        <w:t>- Mobil uygulama geliştirme sürecinin kapsam dışında olması.</w:t>
       </w:r>
     </w:p>
     <w:p>
@@ -180,7 +188,7 @@
         <w:pStyle w:val="ListBullet"/>
       </w:pPr>
       <w:r>
-        <w:t>- Teknik uygunluk (mimari, güvenlik)</w:t>
+        <w:t>- Fonksiyonel gereksinim ve kullanım senaryolarına uyum (Ağırlık: 25%)</w:t>
       </w:r>
     </w:p>
     <w:p>
@@ -188,7 +196,7 @@
         <w:pStyle w:val="ListBullet"/>
       </w:pPr>
       <w:r>
-        <w:t>- Fonksiyonel kapsam ve kullanıcı deneyimi</w:t>
+        <w:t>- Teknik çözüm ve entegrasyon mimarisi uygunluğu (Ağırlık: 15%)</w:t>
       </w:r>
     </w:p>
     <w:p>
@@ -196,7 +204,7 @@
         <w:pStyle w:val="ListBullet"/>
       </w:pPr>
       <w:r>
-        <w:t>- Mevzuat uygunluğu (KVKK &amp; GDPR)</w:t>
+        <w:t>- KVKK/GDPR ve siber güvenlik gereksinimlerini sağlama (Ağırlık: 20%)</w:t>
       </w:r>
     </w:p>
     <w:p>
@@ -204,7 +212,7 @@
         <w:pStyle w:val="ListBullet"/>
       </w:pPr>
       <w:r>
-        <w:t>- Referans projeler ve sektör deneyimi</w:t>
+        <w:t>- Projenin yönetilme ve zaman çizelgesi metodolojisinin kalitesi (Ağırlık: 10%)</w:t>
       </w:r>
     </w:p>
     <w:p>
@@ -212,7 +220,7 @@
         <w:pStyle w:val="ListBullet"/>
       </w:pPr>
       <w:r>
-        <w:t>- Teslim süresi ve plan kalitesi</w:t>
+        <w:t>- Benzer sektörde projeler ve ekibin referansları (Ağırlık: 10%)</w:t>
       </w:r>
     </w:p>
     <w:p>
@@ -220,15 +228,7 @@
         <w:pStyle w:val="ListBullet"/>
       </w:pPr>
       <w:r>
-        <w:t>- SLA ve destek taahhütleri</w:t>
-      </w:r>
-    </w:p>
-    <w:p>
-      <w:pPr>
-        <w:pStyle w:val="ListBullet"/>
-      </w:pPr>
-      <w:r>
-        <w:t>- Fiyat avantajı</w:t>
+        <w:t>- Fiyat ve toplam sahip olma maliyeti avantajı (Ağırlık: 20%)</w:t>
       </w:r>
     </w:p>
     <w:p>
@@ -244,7 +244,7 @@
         <w:pStyle w:val="ListBullet"/>
       </w:pPr>
       <w:r>
-        <w:t>- Kurumsal bilgiler ve referanslar</w:t>
+        <w:t>- Fonksiyonel ve teknik gereksinim matrisi uyumluluk cevapları (E/H/Kısmen)</w:t>
       </w:r>
     </w:p>
     <w:p>
@@ -252,7 +252,7 @@
         <w:pStyle w:val="ListBullet"/>
       </w:pPr>
       <w:r>
-        <w:t>- Teknik ve fonksiyonel çözüm açıklamaları</w:t>
+        <w:t>- SLA ve performans kriterleri taahhüt formu</w:t>
       </w:r>
     </w:p>
     <w:p>
@@ -260,7 +260,7 @@
         <w:pStyle w:val="ListBullet"/>
       </w:pPr>
       <w:r>
-        <w:t>- Yasal uyum ve veri güvenliği yaklaşımları</w:t>
+        <w:t>- KVKK, GDPR ve teknik güvenlik gereksinimleri için cevaplı anket</w:t>
       </w:r>
     </w:p>
     <w:p>
@@ -268,7 +268,7 @@
         <w:pStyle w:val="ListBullet"/>
       </w:pPr>
       <w:r>
-        <w:t>- Proje planı ve teslimat taahhütleri</w:t>
+        <w:t>- Fiyat kalemleri, adet, birim ve toplam fiyat tabloları</w:t>
       </w:r>
     </w:p>
     <w:p>
@@ -276,7 +276,7 @@
         <w:pStyle w:val="ListBullet"/>
       </w:pPr>
       <w:r>
-        <w:t>- Teknik dokümantasyon örnekleri</w:t>
+        <w:t>- Varsayım, istisna/deviation listesi ile tedarikçi beyanı</w:t>
       </w:r>
     </w:p>
     <w:p>
@@ -284,7 +284,7 @@
         <w:pStyle w:val="ListBullet"/>
       </w:pPr>
       <w:r>
-        <w:t>- SLA/destek taahhüt dökümleri</w:t>
+        <w:t>- Scoring Sheet üzerinde kendi değerlendirme puanlarını doldurma ve gerekçelendirme</w:t>
       </w:r>
     </w:p>
     <w:p>
@@ -292,15 +292,7 @@
         <w:pStyle w:val="ListBullet"/>
       </w:pPr>
       <w:r>
-        <w:t>- Ekibin uzmanlık ve rol dağılımı</w:t>
-      </w:r>
-    </w:p>
-    <w:p>
-      <w:pPr>
-        <w:pStyle w:val="ListBullet"/>
-      </w:pPr>
-      <w:r>
-        <w:t>- Fiyat teklifinin ayrıntılı dökümü</w:t>
+        <w:t>- Kurumsal tanıtım, referans projeler ve ilgili teknik ekip özgeçmişleri</w:t>
       </w:r>
     </w:p>
     <w:p>
@@ -320,7 +312,7 @@
           <w:b w:val="0"/>
           <w:i w:val="0"/>
         </w:rPr>
-        <w:t>İsim: [İrtibat Kişisi Eklenmeli]</w:t>
+        <w:t>İsim: Dr. Ece Yıldırım</w:t>
       </w:r>
     </w:p>
     <w:p>
@@ -332,7 +324,7 @@
           <w:b w:val="0"/>
           <w:i w:val="0"/>
         </w:rPr>
-        <w:t>E-posta: [eposta@kurum.com]</w:t>
+        <w:t>E-posta: ece.yildirim@xyzsaglik.com</w:t>
       </w:r>
     </w:p>
     <w:p>
@@ -344,7 +336,7 @@
           <w:b w:val="0"/>
           <w:i w:val="0"/>
         </w:rPr>
-        <w:t>Telefon: [Telefon Numarası Eklenmeli]</w:t>
+        <w:t>Telefon: +90-212-555-2233</w:t>
       </w:r>
     </w:p>
     <w:sectPr>

</xml_diff>